<commit_message>
docs: finalize bioRxiv submission artifacts
</commit_message>
<xml_diff>
--- a/preprint/Plato-Bio-Supplement.docx
+++ b/preprint/Plato-Bio-Supplement.docx
@@ -124,7 +124,7 @@
         <w:jc w:val="left"/>
         <w:tblLayout w:type="fixed"/>
         <w:tblLook w:firstColumn="1" w:firstRow="1" w:lastColumn="0" w:lastRow="0" w:noHBand="0" w:noVBand="1" w:val="04A0"/>
-        <w:tblInd w:type="dxa" w:w="120"/>
+        <w:tblInd w:type="dxa" w:w="110"/>
       </w:tblPr>
       <w:tblGrid>
         <w:gridCol w:w="3133"/>
@@ -816,7 +816,7 @@
         <w:jc w:val="left"/>
         <w:tblLayout w:type="fixed"/>
         <w:tblLook w:firstColumn="1" w:firstRow="1" w:lastColumn="0" w:lastRow="0" w:noHBand="0" w:noVBand="1" w:val="04A0"/>
-        <w:tblInd w:type="dxa" w:w="120"/>
+        <w:tblInd w:type="dxa" w:w="110"/>
       </w:tblPr>
       <w:tblGrid>
         <w:gridCol w:w="2410"/>
@@ -2010,7 +2010,7 @@
         <w:jc w:val="left"/>
         <w:tblLayout w:type="fixed"/>
         <w:tblLook w:firstColumn="1" w:firstRow="1" w:lastColumn="0" w:lastRow="0" w:noHBand="0" w:noVBand="1" w:val="04A0"/>
-        <w:tblInd w:type="dxa" w:w="120"/>
+        <w:tblInd w:type="dxa" w:w="110"/>
       </w:tblPr>
       <w:tblGrid>
         <w:gridCol w:w="3532"/>
@@ -2524,7 +2524,7 @@
                 <w:color w:val="181B1F"/>
                 <w:sz w:val="16"/>
               </w:rPr>
-              <w:t>0.80</w:t>
+              <w:t>0.89</w:t>
             </w:r>
           </w:p>
         </w:tc>
@@ -2774,7 +2774,7 @@
                 <w:color w:val="181B1F"/>
                 <w:sz w:val="16"/>
               </w:rPr>
-              <w:t>0.76</w:t>
+              <w:t>0.70</w:t>
             </w:r>
           </w:p>
         </w:tc>
@@ -3024,7 +3024,7 @@
                 <w:color w:val="181B1F"/>
                 <w:sz w:val="16"/>
               </w:rPr>
-              <w:t>1.62</w:t>
+              <w:t>1.54</w:t>
             </w:r>
           </w:p>
         </w:tc>
@@ -3099,7 +3099,7 @@
                 <w:color w:val="181B1F"/>
                 <w:sz w:val="16"/>
               </w:rPr>
-              <w:t>916</w:t>
+              <w:t>918</w:t>
             </w:r>
           </w:p>
         </w:tc>
@@ -3134,7 +3134,7 @@
                 <w:color w:val="181B1F"/>
                 <w:sz w:val="16"/>
               </w:rPr>
-              <w:t>910</w:t>
+              <w:t>912</w:t>
             </w:r>
           </w:p>
         </w:tc>
@@ -3274,7 +3274,7 @@
                 <w:color w:val="181B1F"/>
                 <w:sz w:val="16"/>
               </w:rPr>
-              <w:t>70.53</w:t>
+              <w:t>67.63</w:t>
             </w:r>
           </w:p>
         </w:tc>
@@ -3524,7 +3524,7 @@
                 <w:color w:val="181B1F"/>
                 <w:sz w:val="16"/>
               </w:rPr>
-              <w:t>1.23</w:t>
+              <w:t>1.15</w:t>
             </w:r>
           </w:p>
         </w:tc>
@@ -4771,6 +4771,7 @@
       <w:spacing w:after="80" w:line="290" w:lineRule="auto"/>
       <w:ind w:left="540" w:hanging="279"/>
       <w:contextualSpacing/>
+      <w:jc w:val="left"/>
     </w:pPr>
     <w:rPr>
       <w:rFonts w:ascii="Times New Roman" w:hAnsi="Times New Roman"/>
@@ -4816,6 +4817,7 @@
       <w:spacing w:after="80" w:line="290" w:lineRule="auto"/>
       <w:ind w:left="540" w:hanging="279"/>
       <w:contextualSpacing/>
+      <w:jc w:val="left"/>
     </w:pPr>
     <w:rPr>
       <w:rFonts w:ascii="Times New Roman" w:hAnsi="Times New Roman"/>

</xml_diff>

<commit_message>
docs: align preprint affiliation and submission package
</commit_message>
<xml_diff>
--- a/preprint/Plato-Bio-Supplement.docx
+++ b/preprint/Plato-Bio-Supplement.docx
@@ -10844,18 +10844,8 @@
   <w:p>
     <w:pPr>
       <w:pStyle w:val="Footer"/>
-      <w:jc w:val="right"/>
     </w:pPr>
-    <w:r>
-      <w:rPr>
-        <w:rFonts w:ascii="Arial" w:hAnsi="Arial"/>
-        <w:color w:val="555F69"/>
-        <w:sz w:val="18"/>
-      </w:rPr>
-      <w:fldChar w:fldCharType="begin"/>
-      <w:instrText xml:space="preserve"> PAGE </w:instrText>
-      <w:fldChar w:fldCharType="end"/>
-    </w:r>
+    <w:r/>
   </w:p>
 </w:ftr>
 </file>

</xml_diff>

<commit_message>
docs: prepare Plato-Bio arXiv submission
</commit_message>
<xml_diff>
--- a/preprint/Plato-Bio-Supplement.docx
+++ b/preprint/Plato-Bio-Supplement.docx
@@ -6702,13 +6702,13 @@
         <w:tblInd w:type="dxa" w:w="110"/>
       </w:tblPr>
       <w:tblGrid>
-        <w:gridCol w:w="2176"/>
-        <w:gridCol w:w="1904"/>
-        <w:gridCol w:w="816"/>
-        <w:gridCol w:w="816"/>
-        <w:gridCol w:w="1088"/>
-        <w:gridCol w:w="1224"/>
-        <w:gridCol w:w="1768"/>
+        <w:gridCol w:w="1484"/>
+        <w:gridCol w:w="2077"/>
+        <w:gridCol w:w="890"/>
+        <w:gridCol w:w="890"/>
+        <w:gridCol w:w="1187"/>
+        <w:gridCol w:w="1335"/>
+        <w:gridCol w:w="1929"/>
       </w:tblGrid>
       <w:tr>
         <w:trPr>
@@ -6717,7 +6717,7 @@
         </w:trPr>
         <w:tc>
           <w:tcPr>
-            <w:tcW w:type="dxa" w:w="2176"/>
+            <w:tcW w:type="dxa" w:w="1484"/>
             <w:vAlign w:val="center"/>
             <w:shd w:fill="E8EEF5"/>
             <w:tcBorders>
@@ -6753,7 +6753,7 @@
         </w:tc>
         <w:tc>
           <w:tcPr>
-            <w:tcW w:type="dxa" w:w="1904"/>
+            <w:tcW w:type="dxa" w:w="2077"/>
             <w:vAlign w:val="center"/>
             <w:shd w:fill="E8EEF5"/>
             <w:tcBorders>
@@ -6789,7 +6789,7 @@
         </w:tc>
         <w:tc>
           <w:tcPr>
-            <w:tcW w:type="dxa" w:w="816"/>
+            <w:tcW w:type="dxa" w:w="890"/>
             <w:vAlign w:val="center"/>
             <w:shd w:fill="E8EEF5"/>
             <w:tcBorders>
@@ -6825,7 +6825,7 @@
         </w:tc>
         <w:tc>
           <w:tcPr>
-            <w:tcW w:type="dxa" w:w="816"/>
+            <w:tcW w:type="dxa" w:w="890"/>
             <w:vAlign w:val="center"/>
             <w:shd w:fill="E8EEF5"/>
             <w:tcBorders>
@@ -6861,7 +6861,7 @@
         </w:tc>
         <w:tc>
           <w:tcPr>
-            <w:tcW w:type="dxa" w:w="1088"/>
+            <w:tcW w:type="dxa" w:w="1187"/>
             <w:vAlign w:val="center"/>
             <w:shd w:fill="E8EEF5"/>
             <w:tcBorders>
@@ -6897,7 +6897,7 @@
         </w:tc>
         <w:tc>
           <w:tcPr>
-            <w:tcW w:type="dxa" w:w="1224"/>
+            <w:tcW w:type="dxa" w:w="1335"/>
             <w:vAlign w:val="center"/>
             <w:shd w:fill="E8EEF5"/>
             <w:tcBorders>
@@ -6933,7 +6933,7 @@
         </w:tc>
         <w:tc>
           <w:tcPr>
-            <w:tcW w:type="dxa" w:w="1768"/>
+            <w:tcW w:type="dxa" w:w="1929"/>
             <w:vAlign w:val="center"/>
             <w:shd w:fill="E8EEF5"/>
             <w:tcBorders>
@@ -6974,7 +6974,7 @@
         </w:trPr>
         <w:tc>
           <w:tcPr>
-            <w:tcW w:type="dxa" w:w="2176"/>
+            <w:tcW w:type="dxa" w:w="1484"/>
             <w:vAlign w:val="center"/>
             <w:tcBorders>
               <w:top w:val="single" w:sz="4" w:color="B9C2CC"/>
@@ -7003,13 +7003,13 @@
                 <w:color w:val="181B1F"/>
                 <w:sz w:val="15"/>
               </w:rPr>
-              <w:t>Synthetic smoke</w:t>
+              <w:t>Synthetic</w:t>
             </w:r>
           </w:p>
         </w:tc>
         <w:tc>
           <w:tcPr>
-            <w:tcW w:type="dxa" w:w="1904"/>
+            <w:tcW w:type="dxa" w:w="2077"/>
             <w:vAlign w:val="center"/>
             <w:tcBorders>
               <w:top w:val="single" w:sz="4" w:color="B9C2CC"/>
@@ -7038,13 +7038,13 @@
                 <w:color w:val="181B1F"/>
                 <w:sz w:val="15"/>
               </w:rPr>
-              <w:t>frequency</w:t>
+              <w:t>Frequency</w:t>
             </w:r>
           </w:p>
         </w:tc>
         <w:tc>
           <w:tcPr>
-            <w:tcW w:type="dxa" w:w="816"/>
+            <w:tcW w:type="dxa" w:w="890"/>
             <w:vAlign w:val="center"/>
             <w:tcBorders>
               <w:top w:val="single" w:sz="4" w:color="B9C2CC"/>
@@ -7079,7 +7079,7 @@
         </w:tc>
         <w:tc>
           <w:tcPr>
-            <w:tcW w:type="dxa" w:w="816"/>
+            <w:tcW w:type="dxa" w:w="890"/>
             <w:vAlign w:val="center"/>
             <w:tcBorders>
               <w:top w:val="single" w:sz="4" w:color="B9C2CC"/>
@@ -7114,7 +7114,7 @@
         </w:tc>
         <w:tc>
           <w:tcPr>
-            <w:tcW w:type="dxa" w:w="1088"/>
+            <w:tcW w:type="dxa" w:w="1187"/>
             <w:vAlign w:val="center"/>
             <w:tcBorders>
               <w:top w:val="single" w:sz="4" w:color="B9C2CC"/>
@@ -7149,7 +7149,7 @@
         </w:tc>
         <w:tc>
           <w:tcPr>
-            <w:tcW w:type="dxa" w:w="1224"/>
+            <w:tcW w:type="dxa" w:w="1335"/>
             <w:vAlign w:val="center"/>
             <w:tcBorders>
               <w:top w:val="single" w:sz="4" w:color="B9C2CC"/>
@@ -7184,7 +7184,7 @@
         </w:tc>
         <w:tc>
           <w:tcPr>
-            <w:tcW w:type="dxa" w:w="1768"/>
+            <w:tcW w:type="dxa" w:w="1929"/>
             <w:vAlign w:val="center"/>
             <w:tcBorders>
               <w:top w:val="single" w:sz="4" w:color="B9C2CC"/>
@@ -7224,7 +7224,7 @@
         </w:trPr>
         <w:tc>
           <w:tcPr>
-            <w:tcW w:type="dxa" w:w="2176"/>
+            <w:tcW w:type="dxa" w:w="1484"/>
             <w:vAlign w:val="center"/>
             <w:tcBorders>
               <w:top w:val="single" w:sz="4" w:color="B9C2CC"/>
@@ -7253,13 +7253,13 @@
                 <w:color w:val="181B1F"/>
                 <w:sz w:val="15"/>
               </w:rPr>
-              <w:t>Synthetic smoke</w:t>
+              <w:t>Synthetic</w:t>
             </w:r>
           </w:p>
         </w:tc>
         <w:tc>
           <w:tcPr>
-            <w:tcW w:type="dxa" w:w="1904"/>
+            <w:tcW w:type="dxa" w:w="2077"/>
             <w:vAlign w:val="center"/>
             <w:tcBorders>
               <w:top w:val="single" w:sz="4" w:color="B9C2CC"/>
@@ -7288,13 +7288,13 @@
                 <w:color w:val="181B1F"/>
                 <w:sz w:val="15"/>
               </w:rPr>
-              <w:t>tfidf</w:t>
+              <w:t>TF-IDF</w:t>
             </w:r>
           </w:p>
         </w:tc>
         <w:tc>
           <w:tcPr>
-            <w:tcW w:type="dxa" w:w="816"/>
+            <w:tcW w:type="dxa" w:w="890"/>
             <w:vAlign w:val="center"/>
             <w:tcBorders>
               <w:top w:val="single" w:sz="4" w:color="B9C2CC"/>
@@ -7329,7 +7329,7 @@
         </w:tc>
         <w:tc>
           <w:tcPr>
-            <w:tcW w:type="dxa" w:w="816"/>
+            <w:tcW w:type="dxa" w:w="890"/>
             <w:vAlign w:val="center"/>
             <w:tcBorders>
               <w:top w:val="single" w:sz="4" w:color="B9C2CC"/>
@@ -7364,7 +7364,7 @@
         </w:tc>
         <w:tc>
           <w:tcPr>
-            <w:tcW w:type="dxa" w:w="1088"/>
+            <w:tcW w:type="dxa" w:w="1187"/>
             <w:vAlign w:val="center"/>
             <w:tcBorders>
               <w:top w:val="single" w:sz="4" w:color="B9C2CC"/>
@@ -7399,7 +7399,7 @@
         </w:tc>
         <w:tc>
           <w:tcPr>
-            <w:tcW w:type="dxa" w:w="1224"/>
+            <w:tcW w:type="dxa" w:w="1335"/>
             <w:vAlign w:val="center"/>
             <w:tcBorders>
               <w:top w:val="single" w:sz="4" w:color="B9C2CC"/>
@@ -7434,7 +7434,7 @@
         </w:tc>
         <w:tc>
           <w:tcPr>
-            <w:tcW w:type="dxa" w:w="1768"/>
+            <w:tcW w:type="dxa" w:w="1929"/>
             <w:vAlign w:val="center"/>
             <w:tcBorders>
               <w:top w:val="single" w:sz="4" w:color="B9C2CC"/>
@@ -7474,7 +7474,7 @@
         </w:trPr>
         <w:tc>
           <w:tcPr>
-            <w:tcW w:type="dxa" w:w="2176"/>
+            <w:tcW w:type="dxa" w:w="1484"/>
             <w:vAlign w:val="center"/>
             <w:tcBorders>
               <w:top w:val="single" w:sz="4" w:color="B9C2CC"/>
@@ -7503,13 +7503,13 @@
                 <w:color w:val="181B1F"/>
                 <w:sz w:val="15"/>
               </w:rPr>
-              <w:t>Synthetic smoke</w:t>
+              <w:t>Synthetic</w:t>
             </w:r>
           </w:p>
         </w:tc>
         <w:tc>
           <w:tcPr>
-            <w:tcW w:type="dxa" w:w="1904"/>
+            <w:tcW w:type="dxa" w:w="2077"/>
             <w:vAlign w:val="center"/>
             <w:tcBorders>
               <w:top w:val="single" w:sz="4" w:color="B9C2CC"/>
@@ -7538,13 +7538,13 @@
                 <w:color w:val="181B1F"/>
                 <w:sz w:val="15"/>
               </w:rPr>
-              <w:t>abc_bridge</w:t>
+              <w:t>A–B/B–C bridge</w:t>
             </w:r>
           </w:p>
         </w:tc>
         <w:tc>
           <w:tcPr>
-            <w:tcW w:type="dxa" w:w="816"/>
+            <w:tcW w:type="dxa" w:w="890"/>
             <w:vAlign w:val="center"/>
             <w:tcBorders>
               <w:top w:val="single" w:sz="4" w:color="B9C2CC"/>
@@ -7579,7 +7579,7 @@
         </w:tc>
         <w:tc>
           <w:tcPr>
-            <w:tcW w:type="dxa" w:w="816"/>
+            <w:tcW w:type="dxa" w:w="890"/>
             <w:vAlign w:val="center"/>
             <w:tcBorders>
               <w:top w:val="single" w:sz="4" w:color="B9C2CC"/>
@@ -7614,7 +7614,7 @@
         </w:tc>
         <w:tc>
           <w:tcPr>
-            <w:tcW w:type="dxa" w:w="1088"/>
+            <w:tcW w:type="dxa" w:w="1187"/>
             <w:vAlign w:val="center"/>
             <w:tcBorders>
               <w:top w:val="single" w:sz="4" w:color="B9C2CC"/>
@@ -7649,7 +7649,7 @@
         </w:tc>
         <w:tc>
           <w:tcPr>
-            <w:tcW w:type="dxa" w:w="1224"/>
+            <w:tcW w:type="dxa" w:w="1335"/>
             <w:vAlign w:val="center"/>
             <w:tcBorders>
               <w:top w:val="single" w:sz="4" w:color="B9C2CC"/>
@@ -7684,7 +7684,7 @@
         </w:tc>
         <w:tc>
           <w:tcPr>
-            <w:tcW w:type="dxa" w:w="1768"/>
+            <w:tcW w:type="dxa" w:w="1929"/>
             <w:vAlign w:val="center"/>
             <w:tcBorders>
               <w:top w:val="single" w:sz="4" w:color="B9C2CC"/>
@@ -7724,7 +7724,7 @@
         </w:trPr>
         <w:tc>
           <w:tcPr>
-            <w:tcW w:type="dxa" w:w="2176"/>
+            <w:tcW w:type="dxa" w:w="1484"/>
             <w:vAlign w:val="center"/>
             <w:tcBorders>
               <w:top w:val="single" w:sz="4" w:color="B9C2CC"/>
@@ -7753,13 +7753,13 @@
                 <w:color w:val="181B1F"/>
                 <w:sz w:val="15"/>
               </w:rPr>
-              <w:t>Synthetic smoke</w:t>
+              <w:t>Synthetic</w:t>
             </w:r>
           </w:p>
         </w:tc>
         <w:tc>
           <w:tcPr>
-            <w:tcW w:type="dxa" w:w="1904"/>
+            <w:tcW w:type="dxa" w:w="2077"/>
             <w:vAlign w:val="center"/>
             <w:tcBorders>
               <w:top w:val="single" w:sz="4" w:color="B9C2CC"/>
@@ -7788,13 +7788,13 @@
                 <w:color w:val="181B1F"/>
                 <w:sz w:val="15"/>
               </w:rPr>
-              <w:t>evidence_aware</w:t>
+              <w:t>Evidence-aware</w:t>
             </w:r>
           </w:p>
         </w:tc>
         <w:tc>
           <w:tcPr>
-            <w:tcW w:type="dxa" w:w="816"/>
+            <w:tcW w:type="dxa" w:w="890"/>
             <w:vAlign w:val="center"/>
             <w:tcBorders>
               <w:top w:val="single" w:sz="4" w:color="B9C2CC"/>
@@ -7829,7 +7829,7 @@
         </w:tc>
         <w:tc>
           <w:tcPr>
-            <w:tcW w:type="dxa" w:w="816"/>
+            <w:tcW w:type="dxa" w:w="890"/>
             <w:vAlign w:val="center"/>
             <w:tcBorders>
               <w:top w:val="single" w:sz="4" w:color="B9C2CC"/>
@@ -7864,7 +7864,7 @@
         </w:tc>
         <w:tc>
           <w:tcPr>
-            <w:tcW w:type="dxa" w:w="1088"/>
+            <w:tcW w:type="dxa" w:w="1187"/>
             <w:vAlign w:val="center"/>
             <w:tcBorders>
               <w:top w:val="single" w:sz="4" w:color="B9C2CC"/>
@@ -7899,7 +7899,7 @@
         </w:tc>
         <w:tc>
           <w:tcPr>
-            <w:tcW w:type="dxa" w:w="1224"/>
+            <w:tcW w:type="dxa" w:w="1335"/>
             <w:vAlign w:val="center"/>
             <w:tcBorders>
               <w:top w:val="single" w:sz="4" w:color="B9C2CC"/>
@@ -7934,7 +7934,7 @@
         </w:tc>
         <w:tc>
           <w:tcPr>
-            <w:tcW w:type="dxa" w:w="1768"/>
+            <w:tcW w:type="dxa" w:w="1929"/>
             <w:vAlign w:val="center"/>
             <w:tcBorders>
               <w:top w:val="single" w:sz="4" w:color="B9C2CC"/>
@@ -7974,7 +7974,7 @@
         </w:trPr>
         <w:tc>
           <w:tcPr>
-            <w:tcW w:type="dxa" w:w="2176"/>
+            <w:tcW w:type="dxa" w:w="1484"/>
             <w:vAlign w:val="center"/>
             <w:tcBorders>
               <w:top w:val="single" w:sz="4" w:color="B9C2CC"/>
@@ -8003,13 +8003,13 @@
                 <w:color w:val="181B1F"/>
                 <w:sz w:val="15"/>
               </w:rPr>
-              <w:t>Historical pilot</w:t>
+              <w:t>Historical</w:t>
             </w:r>
           </w:p>
         </w:tc>
         <w:tc>
           <w:tcPr>
-            <w:tcW w:type="dxa" w:w="1904"/>
+            <w:tcW w:type="dxa" w:w="2077"/>
             <w:vAlign w:val="center"/>
             <w:tcBorders>
               <w:top w:val="single" w:sz="4" w:color="B9C2CC"/>
@@ -8038,13 +8038,13 @@
                 <w:color w:val="181B1F"/>
                 <w:sz w:val="15"/>
               </w:rPr>
-              <w:t>frequency</w:t>
+              <w:t>Frequency</w:t>
             </w:r>
           </w:p>
         </w:tc>
         <w:tc>
           <w:tcPr>
-            <w:tcW w:type="dxa" w:w="816"/>
+            <w:tcW w:type="dxa" w:w="890"/>
             <w:vAlign w:val="center"/>
             <w:tcBorders>
               <w:top w:val="single" w:sz="4" w:color="B9C2CC"/>
@@ -8079,7 +8079,7 @@
         </w:tc>
         <w:tc>
           <w:tcPr>
-            <w:tcW w:type="dxa" w:w="816"/>
+            <w:tcW w:type="dxa" w:w="890"/>
             <w:vAlign w:val="center"/>
             <w:tcBorders>
               <w:top w:val="single" w:sz="4" w:color="B9C2CC"/>
@@ -8114,7 +8114,7 @@
         </w:tc>
         <w:tc>
           <w:tcPr>
-            <w:tcW w:type="dxa" w:w="1088"/>
+            <w:tcW w:type="dxa" w:w="1187"/>
             <w:vAlign w:val="center"/>
             <w:tcBorders>
               <w:top w:val="single" w:sz="4" w:color="B9C2CC"/>
@@ -8149,7 +8149,7 @@
         </w:tc>
         <w:tc>
           <w:tcPr>
-            <w:tcW w:type="dxa" w:w="1224"/>
+            <w:tcW w:type="dxa" w:w="1335"/>
             <w:vAlign w:val="center"/>
             <w:tcBorders>
               <w:top w:val="single" w:sz="4" w:color="B9C2CC"/>
@@ -8184,7 +8184,7 @@
         </w:tc>
         <w:tc>
           <w:tcPr>
-            <w:tcW w:type="dxa" w:w="1768"/>
+            <w:tcW w:type="dxa" w:w="1929"/>
             <w:vAlign w:val="center"/>
             <w:tcBorders>
               <w:top w:val="single" w:sz="4" w:color="B9C2CC"/>
@@ -8224,7 +8224,7 @@
         </w:trPr>
         <w:tc>
           <w:tcPr>
-            <w:tcW w:type="dxa" w:w="2176"/>
+            <w:tcW w:type="dxa" w:w="1484"/>
             <w:vAlign w:val="center"/>
             <w:tcBorders>
               <w:top w:val="single" w:sz="4" w:color="B9C2CC"/>
@@ -8253,13 +8253,13 @@
                 <w:color w:val="181B1F"/>
                 <w:sz w:val="15"/>
               </w:rPr>
-              <w:t>Historical pilot</w:t>
+              <w:t>Historical</w:t>
             </w:r>
           </w:p>
         </w:tc>
         <w:tc>
           <w:tcPr>
-            <w:tcW w:type="dxa" w:w="1904"/>
+            <w:tcW w:type="dxa" w:w="2077"/>
             <w:vAlign w:val="center"/>
             <w:tcBorders>
               <w:top w:val="single" w:sz="4" w:color="B9C2CC"/>
@@ -8288,13 +8288,13 @@
                 <w:color w:val="181B1F"/>
                 <w:sz w:val="15"/>
               </w:rPr>
-              <w:t>tfidf</w:t>
+              <w:t>TF-IDF</w:t>
             </w:r>
           </w:p>
         </w:tc>
         <w:tc>
           <w:tcPr>
-            <w:tcW w:type="dxa" w:w="816"/>
+            <w:tcW w:type="dxa" w:w="890"/>
             <w:vAlign w:val="center"/>
             <w:tcBorders>
               <w:top w:val="single" w:sz="4" w:color="B9C2CC"/>
@@ -8329,7 +8329,7 @@
         </w:tc>
         <w:tc>
           <w:tcPr>
-            <w:tcW w:type="dxa" w:w="816"/>
+            <w:tcW w:type="dxa" w:w="890"/>
             <w:vAlign w:val="center"/>
             <w:tcBorders>
               <w:top w:val="single" w:sz="4" w:color="B9C2CC"/>
@@ -8364,7 +8364,7 @@
         </w:tc>
         <w:tc>
           <w:tcPr>
-            <w:tcW w:type="dxa" w:w="1088"/>
+            <w:tcW w:type="dxa" w:w="1187"/>
             <w:vAlign w:val="center"/>
             <w:tcBorders>
               <w:top w:val="single" w:sz="4" w:color="B9C2CC"/>
@@ -8399,7 +8399,7 @@
         </w:tc>
         <w:tc>
           <w:tcPr>
-            <w:tcW w:type="dxa" w:w="1224"/>
+            <w:tcW w:type="dxa" w:w="1335"/>
             <w:vAlign w:val="center"/>
             <w:tcBorders>
               <w:top w:val="single" w:sz="4" w:color="B9C2CC"/>
@@ -8434,7 +8434,7 @@
         </w:tc>
         <w:tc>
           <w:tcPr>
-            <w:tcW w:type="dxa" w:w="1768"/>
+            <w:tcW w:type="dxa" w:w="1929"/>
             <w:vAlign w:val="center"/>
             <w:tcBorders>
               <w:top w:val="single" w:sz="4" w:color="B9C2CC"/>
@@ -8474,7 +8474,7 @@
         </w:trPr>
         <w:tc>
           <w:tcPr>
-            <w:tcW w:type="dxa" w:w="2176"/>
+            <w:tcW w:type="dxa" w:w="1484"/>
             <w:vAlign w:val="center"/>
             <w:tcBorders>
               <w:top w:val="single" w:sz="4" w:color="B9C2CC"/>
@@ -8503,13 +8503,13 @@
                 <w:color w:val="181B1F"/>
                 <w:sz w:val="15"/>
               </w:rPr>
-              <w:t>Historical pilot</w:t>
+              <w:t>Historical</w:t>
             </w:r>
           </w:p>
         </w:tc>
         <w:tc>
           <w:tcPr>
-            <w:tcW w:type="dxa" w:w="1904"/>
+            <w:tcW w:type="dxa" w:w="2077"/>
             <w:vAlign w:val="center"/>
             <w:tcBorders>
               <w:top w:val="single" w:sz="4" w:color="B9C2CC"/>
@@ -8538,13 +8538,13 @@
                 <w:color w:val="181B1F"/>
                 <w:sz w:val="15"/>
               </w:rPr>
-              <w:t>abc_bridge</w:t>
+              <w:t>A–B/B–C bridge</w:t>
             </w:r>
           </w:p>
         </w:tc>
         <w:tc>
           <w:tcPr>
-            <w:tcW w:type="dxa" w:w="816"/>
+            <w:tcW w:type="dxa" w:w="890"/>
             <w:vAlign w:val="center"/>
             <w:tcBorders>
               <w:top w:val="single" w:sz="4" w:color="B9C2CC"/>
@@ -8579,7 +8579,7 @@
         </w:tc>
         <w:tc>
           <w:tcPr>
-            <w:tcW w:type="dxa" w:w="816"/>
+            <w:tcW w:type="dxa" w:w="890"/>
             <w:vAlign w:val="center"/>
             <w:tcBorders>
               <w:top w:val="single" w:sz="4" w:color="B9C2CC"/>
@@ -8614,7 +8614,7 @@
         </w:tc>
         <w:tc>
           <w:tcPr>
-            <w:tcW w:type="dxa" w:w="1088"/>
+            <w:tcW w:type="dxa" w:w="1187"/>
             <w:vAlign w:val="center"/>
             <w:tcBorders>
               <w:top w:val="single" w:sz="4" w:color="B9C2CC"/>
@@ -8649,7 +8649,7 @@
         </w:tc>
         <w:tc>
           <w:tcPr>
-            <w:tcW w:type="dxa" w:w="1224"/>
+            <w:tcW w:type="dxa" w:w="1335"/>
             <w:vAlign w:val="center"/>
             <w:tcBorders>
               <w:top w:val="single" w:sz="4" w:color="B9C2CC"/>
@@ -8684,7 +8684,7 @@
         </w:tc>
         <w:tc>
           <w:tcPr>
-            <w:tcW w:type="dxa" w:w="1768"/>
+            <w:tcW w:type="dxa" w:w="1929"/>
             <w:vAlign w:val="center"/>
             <w:tcBorders>
               <w:top w:val="single" w:sz="4" w:color="B9C2CC"/>
@@ -8724,7 +8724,7 @@
         </w:trPr>
         <w:tc>
           <w:tcPr>
-            <w:tcW w:type="dxa" w:w="2176"/>
+            <w:tcW w:type="dxa" w:w="1484"/>
             <w:vAlign w:val="center"/>
             <w:tcBorders>
               <w:top w:val="single" w:sz="4" w:color="B9C2CC"/>
@@ -8753,13 +8753,13 @@
                 <w:color w:val="181B1F"/>
                 <w:sz w:val="15"/>
               </w:rPr>
-              <w:t>Historical pilot</w:t>
+              <w:t>Historical</w:t>
             </w:r>
           </w:p>
         </w:tc>
         <w:tc>
           <w:tcPr>
-            <w:tcW w:type="dxa" w:w="1904"/>
+            <w:tcW w:type="dxa" w:w="2077"/>
             <w:vAlign w:val="center"/>
             <w:tcBorders>
               <w:top w:val="single" w:sz="4" w:color="B9C2CC"/>
@@ -8788,13 +8788,13 @@
                 <w:color w:val="181B1F"/>
                 <w:sz w:val="15"/>
               </w:rPr>
-              <w:t>evidence_aware</w:t>
+              <w:t>Evidence-aware</w:t>
             </w:r>
           </w:p>
         </w:tc>
         <w:tc>
           <w:tcPr>
-            <w:tcW w:type="dxa" w:w="816"/>
+            <w:tcW w:type="dxa" w:w="890"/>
             <w:vAlign w:val="center"/>
             <w:tcBorders>
               <w:top w:val="single" w:sz="4" w:color="B9C2CC"/>
@@ -8829,7 +8829,7 @@
         </w:tc>
         <w:tc>
           <w:tcPr>
-            <w:tcW w:type="dxa" w:w="816"/>
+            <w:tcW w:type="dxa" w:w="890"/>
             <w:vAlign w:val="center"/>
             <w:tcBorders>
               <w:top w:val="single" w:sz="4" w:color="B9C2CC"/>
@@ -8864,7 +8864,7 @@
         </w:tc>
         <w:tc>
           <w:tcPr>
-            <w:tcW w:type="dxa" w:w="1088"/>
+            <w:tcW w:type="dxa" w:w="1187"/>
             <w:vAlign w:val="center"/>
             <w:tcBorders>
               <w:top w:val="single" w:sz="4" w:color="B9C2CC"/>
@@ -8899,7 +8899,7 @@
         </w:tc>
         <w:tc>
           <w:tcPr>
-            <w:tcW w:type="dxa" w:w="1224"/>
+            <w:tcW w:type="dxa" w:w="1335"/>
             <w:vAlign w:val="center"/>
             <w:tcBorders>
               <w:top w:val="single" w:sz="4" w:color="B9C2CC"/>
@@ -8934,7 +8934,7 @@
         </w:tc>
         <w:tc>
           <w:tcPr>
-            <w:tcW w:type="dxa" w:w="1768"/>
+            <w:tcW w:type="dxa" w:w="1929"/>
             <w:vAlign w:val="center"/>
             <w:tcBorders>
               <w:top w:val="single" w:sz="4" w:color="B9C2CC"/>
@@ -9765,7 +9765,7 @@
                 <w:color w:val="181B1F"/>
                 <w:sz w:val="16"/>
               </w:rPr>
-              <w:t>0.80</w:t>
+              <w:t>1.38</w:t>
             </w:r>
           </w:p>
         </w:tc>
@@ -10015,7 +10015,7 @@
                 <w:color w:val="181B1F"/>
                 <w:sz w:val="16"/>
               </w:rPr>
-              <w:t>1.57</w:t>
+              <w:t>1.56</w:t>
             </w:r>
           </w:p>
         </w:tc>
@@ -10265,7 +10265,7 @@
                 <w:color w:val="181B1F"/>
                 <w:sz w:val="16"/>
               </w:rPr>
-              <w:t>71.00</w:t>
+              <w:t>79.41</w:t>
             </w:r>
           </w:p>
         </w:tc>
@@ -10515,7 +10515,7 @@
                 <w:color w:val="181B1F"/>
                 <w:sz w:val="16"/>
               </w:rPr>
-              <w:t>1.20</w:t>
+              <w:t>1.68</w:t>
             </w:r>
           </w:p>
         </w:tc>
@@ -10697,133 +10697,19 @@
         <w:pStyle w:val="Heading1"/>
       </w:pPr>
       <w:r>
-        <w:t>S9. bioRxiv packaging notes</w:t>
+        <w:t>S9. arXiv packaging notes</w:t>
       </w:r>
     </w:p>
     <w:p>
-      <w:pPr>
-        <w:pStyle w:val="ListBullet"/>
-      </w:pPr>
       <w:r>
         <w:rPr>
           <w:rFonts w:ascii="Times New Roman" w:hAnsi="Times New Roman"/>
+          <w:b w:val="0"/>
+          <w:i w:val="0"/>
           <w:color w:val="181B1F"/>
-          <w:sz w:val="22"/>
+          <w:sz w:val="21"/>
         </w:rPr>
-        <w:t xml:space="preserve"> </w:t>
-      </w:r>
-      <w:r>
-        <w:rPr>
-          <w:rFonts w:ascii="Times New Roman" w:hAnsi="Times New Roman"/>
-          <w:color w:val="181B1F"/>
-          <w:sz w:val="22"/>
-        </w:rPr>
-        <w:t>Main manuscript is supplied as one PDF with embedded figures and tables.</w:t>
-      </w:r>
-    </w:p>
-    <w:p>
-      <w:pPr>
-        <w:pStyle w:val="ListBullet"/>
-      </w:pPr>
-      <w:r>
-        <w:rPr>
-          <w:rFonts w:ascii="Times New Roman" w:hAnsi="Times New Roman"/>
-          <w:color w:val="181B1F"/>
-          <w:sz w:val="22"/>
-        </w:rPr>
-        <w:t xml:space="preserve"> </w:t>
-      </w:r>
-      <w:r>
-        <w:rPr>
-          <w:rFonts w:ascii="Times New Roman" w:hAnsi="Times New Roman"/>
-          <w:color w:val="181B1F"/>
-          <w:sz w:val="22"/>
-        </w:rPr>
-        <w:t>Supplemental data are separate from the main manuscript.</w:t>
-      </w:r>
-    </w:p>
-    <w:p>
-      <w:pPr>
-        <w:pStyle w:val="ListBullet"/>
-      </w:pPr>
-      <w:r>
-        <w:rPr>
-          <w:rFonts w:ascii="Times New Roman" w:hAnsi="Times New Roman"/>
-          <w:color w:val="181B1F"/>
-          <w:sz w:val="22"/>
-        </w:rPr>
-        <w:t xml:space="preserve"> </w:t>
-      </w:r>
-      <w:r>
-        <w:rPr>
-          <w:rFonts w:ascii="Times New Roman" w:hAnsi="Times New Roman"/>
-          <w:color w:val="181B1F"/>
-          <w:sz w:val="22"/>
-        </w:rPr>
-        <w:t>The work is an English-language computational methods/validation article with Results and Discussion.</w:t>
-      </w:r>
-    </w:p>
-    <w:p>
-      <w:pPr>
-        <w:pStyle w:val="ListBullet"/>
-      </w:pPr>
-      <w:r>
-        <w:rPr>
-          <w:rFonts w:ascii="Times New Roman" w:hAnsi="Times New Roman"/>
-          <w:color w:val="181B1F"/>
-          <w:sz w:val="22"/>
-        </w:rPr>
-        <w:t xml:space="preserve"> </w:t>
-      </w:r>
-      <w:r>
-        <w:rPr>
-          <w:rFonts w:ascii="Times New Roman" w:hAnsi="Times New Roman"/>
-          <w:color w:val="181B1F"/>
-          <w:sz w:val="22"/>
-        </w:rPr>
-        <w:t>No clinical, human-subject, animal, or identifiable-person data are included.</w:t>
-      </w:r>
-    </w:p>
-    <w:p>
-      <w:pPr>
-        <w:pStyle w:val="ListBullet"/>
-      </w:pPr>
-      <w:r>
-        <w:rPr>
-          <w:rFonts w:ascii="Times New Roman" w:hAnsi="Times New Roman"/>
-          <w:color w:val="181B1F"/>
-          <w:sz w:val="22"/>
-        </w:rPr>
-        <w:t xml:space="preserve"> </w:t>
-      </w:r>
-      <w:r>
-        <w:rPr>
-          <w:rFonts w:ascii="Times New Roman" w:hAnsi="Times New Roman"/>
-          <w:color w:val="181B1F"/>
-          <w:sz w:val="22"/>
-        </w:rPr>
-        <w:t>Generative AI assistance is disclosed; the human author remains accountable and the AI is not an author.</w:t>
-      </w:r>
-    </w:p>
-    <w:p>
-      <w:pPr>
-        <w:pStyle w:val="ListBullet"/>
-      </w:pPr>
-      <w:r>
-        <w:rPr>
-          <w:rFonts w:ascii="Times New Roman" w:hAnsi="Times New Roman"/>
-          <w:color w:val="181B1F"/>
-          <w:sz w:val="22"/>
-        </w:rPr>
-        <w:t xml:space="preserve"> </w:t>
-      </w:r>
-      <w:r>
-        <w:rPr>
-          <w:rFonts w:ascii="Times New Roman" w:hAnsi="Times New Roman"/>
-          <w:color w:val="181B1F"/>
-          <w:sz w:val="22"/>
-        </w:rPr>
-        <w:t>The related Denario arXiv preprint is cited as prior work and is not duplicated by this study.</w:t>
+        <w:t>The main manuscript is supplied as LaTeX source with embedded figures and tables; supplemental data are separate. The work is an English-language computational methods and validation article with Results and Discussion. No clinical, human-subject, animal, or identifiable-person data are included. Generative AI assistance is disclosed, the human author remains accountable, and the AI is not an author. The related Denario arXiv preprint is cited as prior work and is not duplicated by this study.</w:t>
       </w:r>
     </w:p>
     <w:sectPr>

</xml_diff>

<commit_message>
docs: correct and revalidate arXiv package
</commit_message>
<xml_diff>
--- a/preprint/Plato-Bio-Supplement.docx
+++ b/preprint/Plato-Bio-Supplement.docx
@@ -9765,7 +9765,7 @@
                 <w:color w:val="181B1F"/>
                 <w:sz w:val="16"/>
               </w:rPr>
-              <w:t>1.38</w:t>
+              <w:t>1.12</w:t>
             </w:r>
           </w:p>
         </w:tc>
@@ -10015,7 +10015,7 @@
                 <w:color w:val="181B1F"/>
                 <w:sz w:val="16"/>
               </w:rPr>
-              <w:t>1.56</w:t>
+              <w:t>1.54</w:t>
             </w:r>
           </w:p>
         </w:tc>
@@ -10265,7 +10265,7 @@
                 <w:color w:val="181B1F"/>
                 <w:sz w:val="16"/>
               </w:rPr>
-              <w:t>79.41</w:t>
+              <w:t>86.72</w:t>
             </w:r>
           </w:p>
         </w:tc>
@@ -10515,7 +10515,7 @@
                 <w:color w:val="181B1F"/>
                 <w:sz w:val="16"/>
               </w:rPr>
-              <w:t>1.68</w:t>
+              <w:t>1.15</w:t>
             </w:r>
           </w:p>
         </w:tc>

</xml_diff>